<commit_message>
Anthropic-Lecture-Prinzipien 29.07.: Kontext-Diaet 2.0 (Betriebs-Chronik ausgelagert, -17% Grundkontext), User-Level CLAUDE.md beidseitig, SDK-JSON via claude-run.sh (Lauf-Journal, 4 Loops umgestellt), .mcp.json versioniert + Werkzeug-Index aller 16 Connectoren, multi-claude.sh mit Speicher-Deckel (beide Pfade nachgemessen), KB wissen/claude-code + Konzept
</commit_message>
<xml_diff>
--- a/docs/konzepte/260729-Anthropic-Lecture-Prinzipien/260729-Anthropic-Lecture-Prinzipien.docx
+++ b/docs/konzepte/260729-Anthropic-Lecture-Prinzipien/260729-Anthropic-Lecture-Prinzipien.docx
@@ -1924,100 +1924,19 @@
       </w:r>
     </w:p>
     <w:p>
-      <w:pPr>
-        <w:pStyle w:val="Heading3"/>
-      </w:pPr>
-      <w:r>
-        <w:t>6. Wissen ablegen</w:t>
+      <w:r>
+        <w:rPr>
+          <w:b/>
+        </w:rPr>
+        <w:t>Beide Pfade nachgemessen</w:t>
+      </w:r>
+      <w:r>
+        <w:t xml:space="preserve"> (Lehre 28.07.: eine Schutzmechanik ist erst fertig, wenn</w:t>
       </w:r>
     </w:p>
     <w:p>
       <w:r>
-        <w:t xml:space="preserve">Neue KB </w:t>
-      </w:r>
-      <w:r>
-        <w:rPr>
-          <w:rFonts w:ascii="Consolas" w:hAnsi="Consolas"/>
-          <w:sz w:val="20"/>
-        </w:rPr>
-        <w:t>wissen/claude-code/</w:t>
-      </w:r>
-      <w:r>
-        <w:t xml:space="preserve"> — Wissen ueber das Werkzeug, auf dem der Hub ruht:</w:t>
-      </w:r>
-    </w:p>
-    <w:p>
-      <w:r>
-        <w:rPr>
-          <w:rFonts w:ascii="Consolas" w:hAnsi="Consolas"/>
-          <w:sz w:val="20"/>
-        </w:rPr>
-        <w:t>raw/</w:t>
-      </w:r>
-      <w:r>
-        <w:t xml:space="preserve"> mit den 32 Slides, </w:t>
-      </w:r>
-      <w:r>
-        <w:rPr>
-          <w:rFonts w:ascii="Consolas" w:hAnsi="Consolas"/>
-          <w:sz w:val="20"/>
-        </w:rPr>
-        <w:t>wiki/lecture-260729-anthropic.md</w:t>
-      </w:r>
-      <w:r>
-        <w:t xml:space="preserve"> (vollstaendiges Destillat),</w:t>
-      </w:r>
-    </w:p>
-    <w:p>
-      <w:r>
-        <w:rPr>
-          <w:rFonts w:ascii="Consolas" w:hAnsi="Consolas"/>
-          <w:sz w:val="20"/>
-        </w:rPr>
-        <w:t>wiki/kontext-architektur.md</w:t>
-      </w:r>
-      <w:r>
-        <w:t xml:space="preserve"> (gemessener Ist-Zustand der vier Schichten samt Budget),</w:t>
-      </w:r>
-    </w:p>
-    <w:p>
-      <w:r>
-        <w:rPr>
-          <w:rFonts w:ascii="Consolas" w:hAnsi="Consolas"/>
-          <w:sz w:val="20"/>
-        </w:rPr>
-        <w:t>INDEX.md</w:t>
-      </w:r>
-      <w:r>
-        <w:t xml:space="preserve">, </w:t>
-      </w:r>
-      <w:r>
-        <w:rPr>
-          <w:rFonts w:ascii="Consolas" w:hAnsi="Consolas"/>
-          <w:sz w:val="20"/>
-        </w:rPr>
-        <w:t>QUESTIONS.md</w:t>
-      </w:r>
-      <w:r>
-        <w:t xml:space="preserve"> (fuenf offene Punkte), </w:t>
-      </w:r>
-      <w:r>
-        <w:rPr>
-          <w:rFonts w:ascii="Consolas" w:hAnsi="Consolas"/>
-          <w:sz w:val="20"/>
-        </w:rPr>
-        <w:t>CHANGELOG.md</w:t>
-      </w:r>
-      <w:r>
-        <w:t>.</w:t>
-      </w:r>
-    </w:p>
-    <w:p>
-      <w:pPr>
-        <w:pStyle w:val="Heading2"/>
-      </w:pPr>
-      <w:r>
-        <w:t>Was bewusst NICHT umgesetzt wurde</w:t>
+        <w:t>Abweisungs- UND Freigabepfad je einmal belegt sind):</w:t>
       </w:r>
     </w:p>
     <w:p>
@@ -2029,30 +1948,30 @@
         <w:rPr>
           <w:b/>
         </w:rPr>
-        <w:t>Enterprise-Policy-Ebene</w:t>
-      </w:r>
-      <w:r>
-        <w:t xml:space="preserve"> (</w:t>
+        <w:t>Abweisung</w:t>
+      </w:r>
+      <w:r>
+        <w:t xml:space="preserve"> — MacBook Pro, 3'820 MB frei bei Druck 2: «ABBRUCH: Speicherdruck 2 — die</w:t>
+      </w:r>
+    </w:p>
+    <w:p>
+      <w:r>
+        <w:t xml:space="preserve">  Station swappt bereits.» Ursache des Drucks gemessen: zwei </w:t>
       </w:r>
       <w:r>
         <w:rPr>
           <w:rFonts w:ascii="Consolas" w:hAnsi="Consolas"/>
           <w:sz w:val="20"/>
         </w:rPr>
-        <w:t>/Library/Application Support/ClaudeCode/</w:t>
-      </w:r>
-      <w:r>
-        <w:t>): fuer zwei</w:t>
+        <w:t>tapir-archicad</w:t>
+      </w:r>
+      <w:r>
+        <w:t>-MCP-Prozesse</w:t>
       </w:r>
     </w:p>
     <w:p>
       <w:r>
-        <w:t xml:space="preserve">  Stationen Overhead. Wird relevant, sobald weitere Mitarbeitende eigene Stationen</w:t>
-      </w:r>
-    </w:p>
-    <w:p>
-      <w:r>
-        <w:t xml:space="preserve">  bekommen. Als offener Punkt erfasst.</w:t>
+        <w:t xml:space="preserve">  mit zusammen 2.8 GB (bereits als offener Punkt im Radar gefuehrt, nicht angetastet).</w:t>
       </w:r>
     </w:p>
     <w:p>
@@ -2064,25 +1983,20 @@
         <w:rPr>
           <w:b/>
         </w:rPr>
-        <w:t>`/install-github-app`</w:t>
-      </w:r>
-      <w:r>
-        <w:t xml:space="preserve"> (@claude auf Issues/PRs): der Hub nutzt GitHub nur als Backup,</w:t>
+        <w:t>Freigabe</w:t>
+      </w:r>
+      <w:r>
+        <w:t xml:space="preserve"> — Mac Mini, 13'235 MB frei bei Druck 1, 0 aktive Laeufe: «Slots: 3 parallel</w:t>
       </w:r>
     </w:p>
     <w:p>
       <w:r>
-        <w:t xml:space="preserve">  der Handy-Weg ueber </w:t>
-      </w:r>
-      <w:r>
-        <w:rPr>
-          <w:rFonts w:ascii="Consolas" w:hAnsi="Consolas"/>
-          <w:sz w:val="20"/>
-        </w:rPr>
-        <w:t>dispatch-run.sh</w:t>
-      </w:r>
-      <w:r>
-        <w:t xml:space="preserve"> ist etabliert. Als offener Punkt erfasst.</w:t>
+        <w:t xml:space="preserve">  (Speicher traegt 3, Prozessdeckel erlaubt 3)» bei 4 Auftraegen. Rechnung stimmt:</w:t>
+      </w:r>
+    </w:p>
+    <w:p>
+      <w:r>
+        <w:t xml:space="preserve">  (13'235 − 4'000) / 3'000 = 3, Deckel 3 − 0 = 3.</w:t>
       </w:r>
     </w:p>
     <w:p>
@@ -2094,6 +2008,239 @@
         <w:rPr>
           <w:b/>
         </w:rPr>
+        <w:t>Worktree-Mechanik</w:t>
+      </w:r>
+      <w:r>
+        <w:t xml:space="preserve"> separat geprueft: anlegen aus dem SSD-Klon, Status-Pruefung,</w:t>
+      </w:r>
+    </w:p>
+    <w:p>
+      <w:r>
+        <w:t xml:space="preserve">  Entfernen — alles sauber.</w:t>
+      </w:r>
+    </w:p>
+    <w:p>
+      <w:r>
+        <w:rPr>
+          <w:rFonts w:ascii="Consolas" w:hAnsi="Consolas"/>
+          <w:sz w:val="20"/>
+        </w:rPr>
+        <w:t>MAX_LAEUFE</w:t>
+      </w:r>
+      <w:r>
+        <w:t xml:space="preserve">, </w:t>
+      </w:r>
+      <w:r>
+        <w:rPr>
+          <w:rFonts w:ascii="Consolas" w:hAnsi="Consolas"/>
+          <w:sz w:val="20"/>
+        </w:rPr>
+        <w:t>MIN_FREI_MB</w:t>
+      </w:r>
+      <w:r>
+        <w:t xml:space="preserve"> und </w:t>
+      </w:r>
+      <w:r>
+        <w:rPr>
+          <w:rFonts w:ascii="Consolas" w:hAnsi="Consolas"/>
+          <w:sz w:val="20"/>
+        </w:rPr>
+        <w:t>PRO_INSTANZ_MB</w:t>
+      </w:r>
+      <w:r>
+        <w:t xml:space="preserve"> sind wie im Gate per Umgebungsvariable</w:t>
+      </w:r>
+    </w:p>
+    <w:p>
+      <w:r>
+        <w:t xml:space="preserve">ueberschreibbar. Das </w:t>
+      </w:r>
+      <w:r>
+        <w:rPr>
+          <w:b/>
+        </w:rPr>
+        <w:t>Druck-Kriterium bewusst nicht</w:t>
+      </w:r>
+      <w:r>
+        <w:t xml:space="preserve"> — eine swappende Maschine soll sich</w:t>
+      </w:r>
+    </w:p>
+    <w:p>
+      <w:r>
+        <w:t>nicht per Umgebungsvariable gesundschreiben lassen.</w:t>
+      </w:r>
+    </w:p>
+    <w:p>
+      <w:pPr>
+        <w:pStyle w:val="Heading3"/>
+      </w:pPr>
+      <w:r>
+        <w:t>6. Wissen ablegen</w:t>
+      </w:r>
+    </w:p>
+    <w:p>
+      <w:r>
+        <w:t xml:space="preserve">Neue KB </w:t>
+      </w:r>
+      <w:r>
+        <w:rPr>
+          <w:rFonts w:ascii="Consolas" w:hAnsi="Consolas"/>
+          <w:sz w:val="20"/>
+        </w:rPr>
+        <w:t>wissen/claude-code/</w:t>
+      </w:r>
+      <w:r>
+        <w:t xml:space="preserve"> — Wissen ueber das Werkzeug, auf dem der Hub ruht:</w:t>
+      </w:r>
+    </w:p>
+    <w:p>
+      <w:r>
+        <w:rPr>
+          <w:rFonts w:ascii="Consolas" w:hAnsi="Consolas"/>
+          <w:sz w:val="20"/>
+        </w:rPr>
+        <w:t>raw/</w:t>
+      </w:r>
+      <w:r>
+        <w:t xml:space="preserve"> mit den 32 Slides, </w:t>
+      </w:r>
+      <w:r>
+        <w:rPr>
+          <w:rFonts w:ascii="Consolas" w:hAnsi="Consolas"/>
+          <w:sz w:val="20"/>
+        </w:rPr>
+        <w:t>wiki/lecture-260729-anthropic.md</w:t>
+      </w:r>
+      <w:r>
+        <w:t xml:space="preserve"> (vollstaendiges Destillat),</w:t>
+      </w:r>
+    </w:p>
+    <w:p>
+      <w:r>
+        <w:rPr>
+          <w:rFonts w:ascii="Consolas" w:hAnsi="Consolas"/>
+          <w:sz w:val="20"/>
+        </w:rPr>
+        <w:t>wiki/kontext-architektur.md</w:t>
+      </w:r>
+      <w:r>
+        <w:t xml:space="preserve"> (gemessener Ist-Zustand der vier Schichten samt Budget),</w:t>
+      </w:r>
+    </w:p>
+    <w:p>
+      <w:r>
+        <w:rPr>
+          <w:rFonts w:ascii="Consolas" w:hAnsi="Consolas"/>
+          <w:sz w:val="20"/>
+        </w:rPr>
+        <w:t>INDEX.md</w:t>
+      </w:r>
+      <w:r>
+        <w:t xml:space="preserve">, </w:t>
+      </w:r>
+      <w:r>
+        <w:rPr>
+          <w:rFonts w:ascii="Consolas" w:hAnsi="Consolas"/>
+          <w:sz w:val="20"/>
+        </w:rPr>
+        <w:t>QUESTIONS.md</w:t>
+      </w:r>
+      <w:r>
+        <w:t xml:space="preserve"> (fuenf offene Punkte), </w:t>
+      </w:r>
+      <w:r>
+        <w:rPr>
+          <w:rFonts w:ascii="Consolas" w:hAnsi="Consolas"/>
+          <w:sz w:val="20"/>
+        </w:rPr>
+        <w:t>CHANGELOG.md</w:t>
+      </w:r>
+      <w:r>
+        <w:t>.</w:t>
+      </w:r>
+    </w:p>
+    <w:p>
+      <w:pPr>
+        <w:pStyle w:val="Heading2"/>
+      </w:pPr>
+      <w:r>
+        <w:t>Was bewusst NICHT umgesetzt wurde</w:t>
+      </w:r>
+    </w:p>
+    <w:p>
+      <w:pPr>
+        <w:pStyle w:val="ListBullet"/>
+        <w:ind w:left="340"/>
+      </w:pPr>
+      <w:r>
+        <w:rPr>
+          <w:b/>
+        </w:rPr>
+        <w:t>Enterprise-Policy-Ebene</w:t>
+      </w:r>
+      <w:r>
+        <w:t xml:space="preserve"> (</w:t>
+      </w:r>
+      <w:r>
+        <w:rPr>
+          <w:rFonts w:ascii="Consolas" w:hAnsi="Consolas"/>
+          <w:sz w:val="20"/>
+        </w:rPr>
+        <w:t>/Library/Application Support/ClaudeCode/</w:t>
+      </w:r>
+      <w:r>
+        <w:t>): fuer zwei</w:t>
+      </w:r>
+    </w:p>
+    <w:p>
+      <w:r>
+        <w:t xml:space="preserve">  Stationen Overhead. Wird relevant, sobald weitere Mitarbeitende eigene Stationen</w:t>
+      </w:r>
+    </w:p>
+    <w:p>
+      <w:r>
+        <w:t xml:space="preserve">  bekommen. Als offener Punkt erfasst.</w:t>
+      </w:r>
+    </w:p>
+    <w:p>
+      <w:pPr>
+        <w:pStyle w:val="ListBullet"/>
+        <w:ind w:left="340"/>
+      </w:pPr>
+      <w:r>
+        <w:rPr>
+          <w:b/>
+        </w:rPr>
+        <w:t>`/install-github-app`</w:t>
+      </w:r>
+      <w:r>
+        <w:t xml:space="preserve"> (@claude auf Issues/PRs): der Hub nutzt GitHub nur als Backup,</w:t>
+      </w:r>
+    </w:p>
+    <w:p>
+      <w:r>
+        <w:t xml:space="preserve">  der Handy-Weg ueber </w:t>
+      </w:r>
+      <w:r>
+        <w:rPr>
+          <w:rFonts w:ascii="Consolas" w:hAnsi="Consolas"/>
+          <w:sz w:val="20"/>
+        </w:rPr>
+        <w:t>dispatch-run.sh</w:t>
+      </w:r>
+      <w:r>
+        <w:t xml:space="preserve"> ist etabliert. Als offener Punkt erfasst.</w:t>
+      </w:r>
+    </w:p>
+    <w:p>
+      <w:pPr>
+        <w:pStyle w:val="ListBullet"/>
+        <w:ind w:left="340"/>
+      </w:pPr>
+      <w:r>
+        <w:rPr>
+          <w:b/>
+        </w:rPr>
         <w:t>User-Level-Slash-Commands</w:t>
       </w:r>
       <w:r>
@@ -2232,17 +2379,119 @@
     </w:p>
     <w:p>
       <w:r>
-        <w:t xml:space="preserve">   bei 2 Input- und 4 Output-Token. Der Grundkontext ist der Kostentreiber, nicht die</w:t>
+        <w:t xml:space="preserve">   bei 2 Input- und 4 Output-Token. Der zweite Lauf: 0.42 USD, 470 Sekunden, ein Turn, zwei</w:t>
       </w:r>
     </w:p>
     <w:p>
       <w:r>
-        <w:t xml:space="preserve">   Aufgabe. Das ist das staerkste Argument fuer die Kontext-Diaet und fuer wenige lange</w:t>
+        <w:t xml:space="preserve">   Zeichen Antwort. Der Grundkontext ist der Kostentreiber, nicht die Aufgabe. Das ist das</w:t>
       </w:r>
     </w:p>
     <w:p>
       <w:r>
-        <w:t xml:space="preserve">   statt vieler kurzer automatischer Laeufe.</w:t>
+        <w:t xml:space="preserve">   staerkste Argument fuer die Kontext-Diaet und dafuer, wenige lange statt vieler kurzer</w:t>
+      </w:r>
+    </w:p>
+    <w:p>
+      <w:r>
+        <w:t xml:space="preserve">   automatischer Laeufe zu fahren.</w:t>
+      </w:r>
+    </w:p>
+    <w:p>
+      <w:pPr>
+        <w:pStyle w:val="ListNumber"/>
+      </w:pPr>
+      <w:r>
+        <w:rPr>
+          <w:b/>
+        </w:rPr>
+        <w:t>Startzeit rund 7-8 Minuten je headless Lauf</w:t>
+      </w:r>
+      <w:r>
+        <w:t xml:space="preserve"> (MCP-Server-Start). Bei Loops faellt das</w:t>
+      </w:r>
+    </w:p>
+    <w:p>
+      <w:r>
+        <w:t xml:space="preserve">   nicht auf, macht aber jeden trivialen automatischen Lauf unwirtschaftlich.</w:t>
+      </w:r>
+    </w:p>
+    <w:p>
+      <w:pPr>
+        <w:pStyle w:val="ListNumber"/>
+      </w:pPr>
+      <w:r>
+        <w:rPr>
+          <w:b/>
+        </w:rPr>
+        <w:t>Auch lesende git-Befehle haengen ueber SMB.</w:t>
+      </w:r>
+      <w:r>
+        <w:t xml:space="preserve"> </w:t>
+      </w:r>
+      <w:r>
+        <w:rPr>
+          <w:rFonts w:ascii="Consolas" w:hAnsi="Consolas"/>
+          <w:sz w:val="20"/>
+        </w:rPr>
+        <w:t>git status --porcelain</w:t>
+      </w:r>
+      <w:r>
+        <w:t xml:space="preserve"> gegen das</w:t>
+      </w:r>
+    </w:p>
+    <w:p>
+      <w:r>
+        <w:t xml:space="preserve">   NAS-Repo lief in den 2-Minuten-Timeout, waehrend im Hintergrund ein Lauf und der</w:t>
+      </w:r>
+    </w:p>
+    <w:p>
+      <w:r>
+        <w:t xml:space="preserve">   15-Min-Committer aktiv waren. Rule 260726 nennt nur schreibende Befehle — praezisiert</w:t>
+      </w:r>
+    </w:p>
+    <w:p>
+      <w:r>
+        <w:t xml:space="preserve">   in </w:t>
+      </w:r>
+      <w:r>
+        <w:rPr>
+          <w:rFonts w:ascii="Consolas" w:hAnsi="Consolas"/>
+          <w:sz w:val="20"/>
+        </w:rPr>
+        <w:t>rules/betrieb-chronik.md</w:t>
+      </w:r>
+      <w:r>
+        <w:t>, Eintrag 260729.</w:t>
+      </w:r>
+    </w:p>
+    <w:p>
+      <w:pPr>
+        <w:pStyle w:val="ListNumber"/>
+      </w:pPr>
+      <w:r>
+        <w:rPr>
+          <w:b/>
+        </w:rPr>
+        <w:t>Zwei verwaiste Claude-Worktrees</w:t>
+      </w:r>
+      <w:r>
+        <w:t xml:space="preserve"> unter </w:t>
+      </w:r>
+      <w:r>
+        <w:rPr>
+          <w:rFonts w:ascii="Consolas" w:hAnsi="Consolas"/>
+          <w:sz w:val="20"/>
+        </w:rPr>
+        <w:t>.claude/worktrees/</w:t>
+      </w:r>
+      <w:r>
+        <w:t xml:space="preserve"> (amazing-feistel,</w:t>
+      </w:r>
+    </w:p>
+    <w:p>
+      <w:r>
+        <w:t xml:space="preserve">   jolly-brattain) auf einem alten Commit. Nicht angetastet, aber aufraeumenswert.</w:t>
       </w:r>
     </w:p>
     <w:p>

</xml_diff>

<commit_message>
Trust-Befund behoben: wissens-trigger lief ohne cd im untrusted Home (Beleg 27.07. 21:52 planungsgrundlagen-training antwortete mit Rueckfrage statt Arbeit, rc=0) -> cd in SSD-Klon + Arbeitsverzeichnis im Log; trust-check.sh (idempotent, atomar, nur Hub-Pfade, nie Home) als heartbeat-Check 8; Chronik + Kurzregel + Konzept nachgefuehrt
</commit_message>
<xml_diff>
--- a/docs/konzepte/260729-Anthropic-Lecture-Prinzipien/260729-Anthropic-Lecture-Prinzipien.docx
+++ b/docs/konzepte/260729-Anthropic-Lecture-Prinzipien/260729-Anthropic-Lecture-Prinzipien.docx
@@ -2161,10 +2161,421 @@
     </w:p>
     <w:p>
       <w:pPr>
-        <w:pStyle w:val="Heading2"/>
+        <w:pStyle w:val="Heading3"/>
       </w:pPr>
       <w:r>
-        <w:t>Was bewusst NICHT umgesetzt wurde</w:t>
+        <w:t>7. Projekt-Vertrauen: ein Loop arbeitete ohne Hub-Kontext (Folgeauftrag)</w:t>
+      </w:r>
+    </w:p>
+    <w:p>
+      <w:r>
+        <w:t>Dem Nebenbefund «workspace has not been trusted» wurde auf Anweisung Raphaels nachgegangen.</w:t>
+      </w:r>
+    </w:p>
+    <w:p>
+      <w:r>
+        <w:t>Er ist kein kosmetisches Warnthema, sondern hat bereits einen Lauf gekostet.</w:t>
+      </w:r>
+    </w:p>
+    <w:p>
+      <w:r>
+        <w:rPr>
+          <w:b/>
+        </w:rPr>
+        <w:t>Der Mechanismus.</w:t>
+      </w:r>
+      <w:r>
+        <w:t xml:space="preserve"> Claude Code laedt </w:t>
+      </w:r>
+      <w:r>
+        <w:rPr>
+          <w:rFonts w:ascii="Consolas" w:hAnsi="Consolas"/>
+          <w:sz w:val="20"/>
+        </w:rPr>
+        <w:t>.claude/settings.json</w:t>
+      </w:r>
+      <w:r>
+        <w:t xml:space="preserve"> und die Projekt-</w:t>
+      </w:r>
+      <w:r>
+        <w:rPr>
+          <w:rFonts w:ascii="Consolas" w:hAnsi="Consolas"/>
+          <w:sz w:val="20"/>
+        </w:rPr>
+        <w:t>CLAUDE.md</w:t>
+      </w:r>
+    </w:p>
+    <w:p>
+      <w:r>
+        <w:t xml:space="preserve">nur in einem Arbeitsverzeichnis, das in </w:t>
+      </w:r>
+      <w:r>
+        <w:rPr>
+          <w:rFonts w:ascii="Consolas" w:hAnsi="Consolas"/>
+          <w:sz w:val="20"/>
+        </w:rPr>
+        <w:t>~/.claude.json</w:t>
+      </w:r>
+      <w:r>
+        <w:t xml:space="preserve"> unter</w:t>
+      </w:r>
+    </w:p>
+    <w:p>
+      <w:r>
+        <w:rPr>
+          <w:rFonts w:ascii="Consolas" w:hAnsi="Consolas"/>
+          <w:sz w:val="20"/>
+        </w:rPr>
+        <w:t>projects[&lt;pfad&gt;].hasTrustDialogAccepted: true</w:t>
+      </w:r>
+      <w:r>
+        <w:t xml:space="preserve"> steht. Der Eintrag entsteht normalerweise</w:t>
+      </w:r>
+    </w:p>
+    <w:p>
+      <w:r>
+        <w:t xml:space="preserve">durch den interaktiven Trust-Dialog — den ein headless </w:t>
+      </w:r>
+      <w:r>
+        <w:rPr>
+          <w:rFonts w:ascii="Consolas" w:hAnsi="Consolas"/>
+          <w:sz w:val="20"/>
+        </w:rPr>
+        <w:t>claude -p</w:t>
+      </w:r>
+      <w:r>
+        <w:t xml:space="preserve"> nicht beantworten kann.</w:t>
+      </w:r>
+    </w:p>
+    <w:p>
+      <w:r>
+        <w:t xml:space="preserve">Es warnt, arbeitet ohne Projekt-Kontext weiter und endet mit </w:t>
+      </w:r>
+      <w:r>
+        <w:rPr>
+          <w:b/>
+        </w:rPr>
+        <w:t>rc=0</w:t>
+      </w:r>
+      <w:r>
+        <w:t>. Im Log ist ein</w:t>
+      </w:r>
+    </w:p>
+    <w:p>
+      <w:r>
+        <w:t>solcher Lauf von einem gesunden nicht zu unterscheiden.</w:t>
+      </w:r>
+    </w:p>
+    <w:p>
+      <w:r>
+        <w:rPr>
+          <w:b/>
+        </w:rPr>
+        <w:t>Gemessener Zustand (MacBook Pro, 29.07.2026):</w:t>
+      </w:r>
+    </w:p>
+    <w:tbl>
+      <w:tblPr>
+        <w:tblStyle w:val="TableGrid"/>
+        <w:tblW w:type="auto" w:w="0"/>
+        <w:tblLook w:firstColumn="1" w:firstRow="1" w:lastColumn="0" w:lastRow="0" w:noHBand="0" w:noVBand="1" w:val="04A0"/>
+      </w:tblPr>
+      <w:tblGrid>
+        <w:gridCol w:w="4819"/>
+        <w:gridCol w:w="4819"/>
+      </w:tblGrid>
+      <w:tr>
+        <w:tc>
+          <w:tcPr>
+            <w:tcW w:type="dxa" w:w="4819"/>
+            <w:shd w:val="clear" w:fill="F2F2F2"/>
+          </w:tcPr>
+          <w:p>
+            <w:r>
+              <w:rPr>
+                <w:rFonts w:ascii="Cambria" w:hAnsi="Cambria"/>
+                <w:b/>
+                <w:sz w:val="20"/>
+              </w:rPr>
+              <w:t>Pfad</w:t>
+            </w:r>
+          </w:p>
+        </w:tc>
+        <w:tc>
+          <w:tcPr>
+            <w:tcW w:type="dxa" w:w="4819"/>
+            <w:shd w:val="clear" w:fill="F2F2F2"/>
+          </w:tcPr>
+          <w:p>
+            <w:r>
+              <w:rPr>
+                <w:rFonts w:ascii="Cambria" w:hAnsi="Cambria"/>
+                <w:b/>
+                <w:sz w:val="20"/>
+              </w:rPr>
+              <w:t>Zustand</w:t>
+            </w:r>
+          </w:p>
+        </w:tc>
+      </w:tr>
+      <w:tr>
+        <w:tc>
+          <w:tcPr>
+            <w:tcW w:type="dxa" w:w="4819"/>
+          </w:tcPr>
+          <w:p>
+            <w:r>
+              <w:rPr>
+                <w:rFonts w:ascii="Cambria" w:hAnsi="Cambria"/>
+                <w:sz w:val="20"/>
+              </w:rPr>
+              <w:t>~/Developer/jans-ai-hub</w:t>
+            </w:r>
+          </w:p>
+        </w:tc>
+        <w:tc>
+          <w:tcPr>
+            <w:tcW w:type="dxa" w:w="4819"/>
+          </w:tcPr>
+          <w:p>
+            <w:r>
+              <w:rPr>
+                <w:rFonts w:ascii="Cambria" w:hAnsi="Cambria"/>
+                <w:sz w:val="20"/>
+              </w:rPr>
+              <w:t>vertraut</w:t>
+            </w:r>
+          </w:p>
+        </w:tc>
+      </w:tr>
+      <w:tr>
+        <w:tc>
+          <w:tcPr>
+            <w:tcW w:type="dxa" w:w="4819"/>
+          </w:tcPr>
+          <w:p>
+            <w:r>
+              <w:rPr>
+                <w:rFonts w:ascii="Cambria" w:hAnsi="Cambria"/>
+                <w:sz w:val="20"/>
+              </w:rPr>
+              <w:t>/Volumes/daten/jans-ai-hub</w:t>
+            </w:r>
+          </w:p>
+        </w:tc>
+        <w:tc>
+          <w:tcPr>
+            <w:tcW w:type="dxa" w:w="4819"/>
+          </w:tcPr>
+          <w:p>
+            <w:r>
+              <w:rPr>
+                <w:rFonts w:ascii="Cambria" w:hAnsi="Cambria"/>
+                <w:b/>
+                <w:sz w:val="20"/>
+              </w:rPr>
+              <w:t>kein Eintrag</w:t>
+            </w:r>
+          </w:p>
+        </w:tc>
+      </w:tr>
+      <w:tr>
+        <w:tc>
+          <w:tcPr>
+            <w:tcW w:type="dxa" w:w="4819"/>
+          </w:tcPr>
+          <w:p>
+            <w:r>
+              <w:rPr>
+                <w:rFonts w:ascii="Cambria" w:hAnsi="Cambria"/>
+                <w:sz w:val="20"/>
+              </w:rPr>
+              <w:t>~</w:t>
+            </w:r>
+            <w:r>
+              <w:rPr>
+                <w:rFonts w:ascii="Cambria" w:hAnsi="Cambria"/>
+                <w:sz w:val="20"/>
+              </w:rPr>
+              <w:t xml:space="preserve"> (Home)</w:t>
+            </w:r>
+          </w:p>
+        </w:tc>
+        <w:tc>
+          <w:tcPr>
+            <w:tcW w:type="dxa" w:w="4819"/>
+          </w:tcPr>
+          <w:p>
+            <w:r>
+              <w:rPr>
+                <w:rFonts w:ascii="Cambria" w:hAnsi="Cambria"/>
+                <w:sz w:val="20"/>
+              </w:rPr>
+              <w:t xml:space="preserve">ausdruecklich </w:t>
+            </w:r>
+            <w:r>
+              <w:rPr>
+                <w:rFonts w:ascii="Cambria" w:hAnsi="Cambria"/>
+                <w:sz w:val="20"/>
+              </w:rPr>
+              <w:t>false</w:t>
+            </w:r>
+          </w:p>
+        </w:tc>
+      </w:tr>
+    </w:tbl>
+    <w:p>
+      <w:r>
+        <w:rPr>
+          <w:b/>
+        </w:rPr>
+        <w:t>Wer betroffen war.</w:t>
+      </w:r>
+      <w:r>
+        <w:t xml:space="preserve"> Die Arbeitsverzeichnisse aller Feuermechanismen geprueft:</w:t>
+      </w:r>
+    </w:p>
+    <w:p>
+      <w:r>
+        <w:rPr>
+          <w:rFonts w:ascii="Consolas" w:hAnsi="Consolas"/>
+          <w:sz w:val="20"/>
+        </w:rPr>
+        <w:t>vollgas-runner</w:t>
+      </w:r>
+      <w:r>
+        <w:t xml:space="preserve">, </w:t>
+      </w:r>
+      <w:r>
+        <w:rPr>
+          <w:rFonts w:ascii="Consolas" w:hAnsi="Consolas"/>
+          <w:sz w:val="20"/>
+        </w:rPr>
+        <w:t>dispatch-run</w:t>
+      </w:r>
+      <w:r>
+        <w:t xml:space="preserve"> und </w:t>
+      </w:r>
+      <w:r>
+        <w:rPr>
+          <w:rFonts w:ascii="Consolas" w:hAnsi="Consolas"/>
+          <w:sz w:val="20"/>
+        </w:rPr>
+        <w:t>nachtschicht-run</w:t>
+      </w:r>
+      <w:r>
+        <w:t xml:space="preserve"> wechseln in den SSD-Klon und sind</w:t>
+      </w:r>
+    </w:p>
+    <w:p>
+      <w:r>
+        <w:t xml:space="preserve">damit </w:t>
+      </w:r>
+      <w:r>
+        <w:rPr>
+          <w:b/>
+        </w:rPr>
+        <w:t>in Ordnung</w:t>
+      </w:r>
+      <w:r>
+        <w:t xml:space="preserve">. </w:t>
+      </w:r>
+      <w:r>
+        <w:rPr>
+          <w:rFonts w:ascii="Consolas" w:hAnsi="Consolas"/>
+          <w:sz w:val="20"/>
+        </w:rPr>
+        <w:t>wissens-trigger.sh</w:t>
+      </w:r>
+      <w:r>
+        <w:t xml:space="preserve"> war der </w:t>
+      </w:r>
+      <w:r>
+        <w:rPr>
+          <w:b/>
+        </w:rPr>
+        <w:t>einzige ohne `cd`</w:t>
+      </w:r>
+      <w:r>
+        <w:t xml:space="preserve"> — und weil die</w:t>
+      </w:r>
+    </w:p>
+    <w:p>
+      <w:r>
+        <w:t xml:space="preserve">launchd-Jobs kein </w:t>
+      </w:r>
+      <w:r>
+        <w:rPr>
+          <w:rFonts w:ascii="Consolas" w:hAnsi="Consolas"/>
+          <w:sz w:val="20"/>
+        </w:rPr>
+        <w:t>WorkingDirectory</w:t>
+      </w:r>
+      <w:r>
+        <w:t xml:space="preserve"> setzen, startete er im Home-Verzeichnis.</w:t>
+      </w:r>
+    </w:p>
+    <w:p>
+      <w:r>
+        <w:rPr>
+          <w:b/>
+        </w:rPr>
+        <w:t>Der Beleg.</w:t>
+      </w:r>
+      <w:r>
+        <w:t xml:space="preserve"> Eigenes Log, 27.07.2026 21:52: </w:t>
+      </w:r>
+      <w:r>
+        <w:rPr>
+          <w:rFonts w:ascii="Consolas" w:hAnsi="Consolas"/>
+          <w:sz w:val="20"/>
+        </w:rPr>
+        <w:t>planungsgrundlagen-training</w:t>
+      </w:r>
+      <w:r>
+        <w:t xml:space="preserve"> endete nach</w:t>
+      </w:r>
+    </w:p>
+    <w:p>
+      <w:r>
+        <w:t xml:space="preserve">28 Sekunden mit rc=0 und einer </w:t>
+      </w:r>
+      <w:r>
+        <w:rPr>
+          <w:b/>
+        </w:rPr>
+        <w:t>Rueckfrage</w:t>
+      </w:r>
+      <w:r>
+        <w:t xml:space="preserve"> statt Arbeit — «Could you confirm: 1. Are you</w:t>
+      </w:r>
+    </w:p>
+    <w:p>
+      <w:r>
+        <w:t>intentionally asking me to run this training pass right now …». Ohne Projekt-Kontext</w:t>
+      </w:r>
+    </w:p>
+    <w:p>
+      <w:r>
+        <w:t>verstand der Lauf den SKILL.md-Prompt nicht als Auftrag im Hub. Der Loop protokollierte</w:t>
+      </w:r>
+    </w:p>
+    <w:p>
+      <w:r>
+        <w:t>«1 Lauf ausgeloest». Genau das Muster, das der Liefer-Delta-Nachtrag beschreibt: ein Lauf,</w:t>
+      </w:r>
+    </w:p>
+    <w:p>
+      <w:r>
+        <w:t>der stattfand und nichts lieferte.</w:t>
+      </w:r>
+    </w:p>
+    <w:p>
+      <w:r>
+        <w:rPr>
+          <w:b/>
+        </w:rPr>
+        <w:t>Umgesetzt:</w:t>
       </w:r>
     </w:p>
     <w:p>
@@ -2174,32 +2585,37 @@
       </w:pPr>
       <w:r>
         <w:rPr>
-          <w:b/>
-        </w:rPr>
-        <w:t>Enterprise-Policy-Ebene</w:t>
-      </w:r>
-      <w:r>
-        <w:t xml:space="preserve"> (</w:t>
-      </w:r>
-      <w:r>
-        <w:rPr>
           <w:rFonts w:ascii="Consolas" w:hAnsi="Consolas"/>
           <w:sz w:val="20"/>
         </w:rPr>
-        <w:t>/Library/Application Support/ClaudeCode/</w:t>
-      </w:r>
-      <w:r>
-        <w:t>): fuer zwei</w:t>
+        <w:t>scripts/wissens-trigger.sh</w:t>
+      </w:r>
+      <w:r>
+        <w:t xml:space="preserve"> wechselt in den SSD-Klon (NAS als Rueckfall) und</w:t>
       </w:r>
     </w:p>
     <w:p>
       <w:r>
-        <w:t xml:space="preserve">  Stationen Overhead. Wird relevant, sobald weitere Mitarbeitende eigene Stationen</w:t>
+        <w:t xml:space="preserve">  </w:t>
+      </w:r>
+      <w:r>
+        <w:rPr>
+          <w:b/>
+        </w:rPr>
+        <w:t>protokolliert sein Arbeitsverzeichnis</w:t>
+      </w:r>
+      <w:r>
+        <w:t xml:space="preserve"> in jedem Durchgang — ohne diese Zeile blieb der</w:t>
       </w:r>
     </w:p>
     <w:p>
       <w:r>
-        <w:t xml:space="preserve">  bekommen. Als offener Punkt erfasst.</w:t>
+        <w:t xml:space="preserve">  Fehler unsichtbar. Trockenlauf verifiziert: «Arbeitsverzeichnis:</w:t>
+      </w:r>
+    </w:p>
+    <w:p>
+      <w:r>
+        <w:t xml:space="preserve">  /Users/raphaeljans/Developer/jans-ai-hub».</w:t>
       </w:r>
     </w:p>
     <w:p>
@@ -2209,27 +2625,49 @@
       </w:pPr>
       <w:r>
         <w:rPr>
+          <w:rFonts w:ascii="Consolas" w:hAnsi="Consolas"/>
+          <w:sz w:val="20"/>
+        </w:rPr>
+        <w:t>scripts/trust-check.sh</w:t>
+      </w:r>
+      <w:r>
+        <w:t xml:space="preserve"> prueft die Hub-Pfade und setzt fehlendes Vertrauen idempotent</w:t>
+      </w:r>
+    </w:p>
+    <w:p>
+      <w:r>
+        <w:t xml:space="preserve">  (atomar ueber temporaere Datei, mit Zeitstempel-Backup). Vertrauen wird </w:t>
+      </w:r>
+      <w:r>
+        <w:rPr>
           <w:b/>
         </w:rPr>
-        <w:t>`/install-github-app`</w:t>
-      </w:r>
-      <w:r>
-        <w:t xml:space="preserve"> (@claude auf Issues/PRs): der Hub nutzt GitHub nur als Backup,</w:t>
+        <w:t>ausschliesslich</w:t>
       </w:r>
     </w:p>
     <w:p>
       <w:r>
-        <w:t xml:space="preserve">  der Handy-Weg ueber </w:t>
+        <w:t xml:space="preserve">  fuer die zwei fest verdrahteten Hub-Pfade gesetzt, nie fuer einen uebergebenen Pfad und</w:t>
+      </w:r>
+    </w:p>
+    <w:p>
+      <w:r>
+        <w:t xml:space="preserve">  nie fuers Home-Verzeichnis; ein zusaetzlicher Kontrollblick warnt, falls </w:t>
       </w:r>
       <w:r>
         <w:rPr>
           <w:rFonts w:ascii="Consolas" w:hAnsi="Consolas"/>
           <w:sz w:val="20"/>
         </w:rPr>
-        <w:t>dispatch-run.sh</w:t>
-      </w:r>
-      <w:r>
-        <w:t xml:space="preserve"> ist etabliert. Als offener Punkt erfasst.</w:t>
+        <w:t>~</w:t>
+      </w:r>
+      <w:r>
+        <w:t xml:space="preserve"> je als</w:t>
+      </w:r>
+    </w:p>
+    <w:p>
+      <w:r>
+        <w:t xml:space="preserve">  vertraut auftaucht. Pruefpfad verifiziert (erkennt die Luecke, Exit 1).</w:t>
       </w:r>
     </w:p>
     <w:p>
@@ -2238,276 +2676,26 @@
         <w:ind w:left="340"/>
       </w:pPr>
       <w:r>
+        <w:t xml:space="preserve">Als </w:t>
+      </w:r>
+      <w:r>
         <w:rPr>
           <w:b/>
         </w:rPr>
-        <w:t>User-Level-Slash-Commands</w:t>
-      </w:r>
-      <w:r>
-        <w:t xml:space="preserve"> (</w:t>
+        <w:t>Check 8</w:t>
+      </w:r>
+      <w:r>
+        <w:t xml:space="preserve"> im Skill </w:t>
       </w:r>
       <w:r>
         <w:rPr>
           <w:rFonts w:ascii="Consolas" w:hAnsi="Consolas"/>
           <w:sz w:val="20"/>
         </w:rPr>
-        <w:t>~/.claude/commands/</w:t>
-      </w:r>
-      <w:r>
-        <w:t xml:space="preserve">): waere fuer </w:t>
-      </w:r>
-      <w:r>
-        <w:rPr>
-          <w:rFonts w:ascii="Consolas" w:hAnsi="Consolas"/>
-          <w:sz w:val="20"/>
-        </w:rPr>
-        <w:t>/nas</w:t>
-      </w:r>
-      <w:r>
-        <w:t xml:space="preserve">, </w:t>
-      </w:r>
-      <w:r>
-        <w:rPr>
-          <w:rFonts w:ascii="Consolas" w:hAnsi="Consolas"/>
-          <w:sz w:val="20"/>
-        </w:rPr>
-        <w:t>/status</w:t>
-      </w:r>
-      <w:r>
-        <w:t>,</w:t>
-      </w:r>
-    </w:p>
-    <w:p>
-      <w:r>
-        <w:t xml:space="preserve">  </w:t>
-      </w:r>
-      <w:r>
-        <w:rPr>
-          <w:rFonts w:ascii="Consolas" w:hAnsi="Consolas"/>
-          <w:sz w:val="20"/>
-        </w:rPr>
-        <w:t>/m365</w:t>
-      </w:r>
-      <w:r>
-        <w:t xml:space="preserve"> sinnvoll, aber nicht Teil des Auftrags. Als offener Punkt erfasst.</w:t>
-      </w:r>
-    </w:p>
-    <w:p>
-      <w:pPr>
-        <w:pStyle w:val="Heading2"/>
-      </w:pPr>
-      <w:r>
-        <w:t>Nebenbefunde aus der Messung</w:t>
-      </w:r>
-    </w:p>
-    <w:p>
-      <w:pPr>
-        <w:pStyle w:val="ListNumber"/>
-      </w:pPr>
-      <w:r>
-        <w:rPr>
-          <w:b/>
-        </w:rPr>
-        <w:t>Workspace nicht «trusted».</w:t>
-      </w:r>
-      <w:r>
-        <w:t xml:space="preserve"> Headless-Laeufe aus </w:t>
-      </w:r>
-      <w:r>
-        <w:rPr>
-          <w:rFonts w:ascii="Consolas" w:hAnsi="Consolas"/>
-          <w:sz w:val="20"/>
-        </w:rPr>
-        <w:t>/Volumes/daten/jans-ai-hub</w:t>
-      </w:r>
-      <w:r>
-        <w:t xml:space="preserve"> melden</w:t>
-      </w:r>
-    </w:p>
-    <w:p>
-      <w:r>
-        <w:t xml:space="preserve">   «Ignoring 29 permissions.allow entries from .claude/settings.json: this workspace has</w:t>
-      </w:r>
-    </w:p>
-    <w:p>
-      <w:r>
-        <w:t xml:space="preserve">   not been trusted». Die 29 Berechtigungen der geteilten </w:t>
-      </w:r>
-      <w:r>
-        <w:rPr>
-          <w:rFonts w:ascii="Consolas" w:hAnsi="Consolas"/>
-          <w:sz w:val="20"/>
-        </w:rPr>
-        <w:t>settings.json</w:t>
-      </w:r>
-      <w:r>
-        <w:t xml:space="preserve"> greifen dort</w:t>
-      </w:r>
-    </w:p>
-    <w:p>
-      <w:r>
-        <w:t xml:space="preserve">   also </w:t>
-      </w:r>
-      <w:r>
-        <w:rPr>
-          <w:b/>
-        </w:rPr>
-        <w:t>nicht</w:t>
-      </w:r>
-      <w:r>
-        <w:t>. Zu klaeren, ob das die produktiven Loops betrifft — siehe offene Punkte.</w:t>
-      </w:r>
-    </w:p>
-    <w:p>
-      <w:pPr>
-        <w:pStyle w:val="ListNumber"/>
-      </w:pPr>
-      <w:r>
-        <w:rPr>
-          <w:b/>
-        </w:rPr>
-        <w:t>Cache-Creation dominiert die Kosten kleiner Laeufe.</w:t>
-      </w:r>
-      <w:r>
-        <w:t xml:space="preserve"> Ein Testlauf mit dem Prompt</w:t>
-      </w:r>
-    </w:p>
-    <w:p>
-      <w:r>
-        <w:t xml:space="preserve">   «Antworte mit genau dem Wort: OK» erzeugte 89'618 Cache-Creation-Token und 0.54 USD —</w:t>
-      </w:r>
-    </w:p>
-    <w:p>
-      <w:r>
-        <w:t xml:space="preserve">   bei 2 Input- und 4 Output-Token. Der zweite Lauf: 0.42 USD, 470 Sekunden, ein Turn, zwei</w:t>
-      </w:r>
-    </w:p>
-    <w:p>
-      <w:r>
-        <w:t xml:space="preserve">   Zeichen Antwort. Der Grundkontext ist der Kostentreiber, nicht die Aufgabe. Das ist das</w:t>
-      </w:r>
-    </w:p>
-    <w:p>
-      <w:r>
-        <w:t xml:space="preserve">   staerkste Argument fuer die Kontext-Diaet und dafuer, wenige lange statt vieler kurzer</w:t>
-      </w:r>
-    </w:p>
-    <w:p>
-      <w:r>
-        <w:t xml:space="preserve">   automatischer Laeufe zu fahren.</w:t>
-      </w:r>
-    </w:p>
-    <w:p>
-      <w:pPr>
-        <w:pStyle w:val="ListNumber"/>
-      </w:pPr>
-      <w:r>
-        <w:rPr>
-          <w:b/>
-        </w:rPr>
-        <w:t>Startzeit rund 7-8 Minuten je headless Lauf</w:t>
-      </w:r>
-      <w:r>
-        <w:t xml:space="preserve"> (MCP-Server-Start). Bei Loops faellt das</w:t>
-      </w:r>
-    </w:p>
-    <w:p>
-      <w:r>
-        <w:t xml:space="preserve">   nicht auf, macht aber jeden trivialen automatischen Lauf unwirtschaftlich.</w:t>
-      </w:r>
-    </w:p>
-    <w:p>
-      <w:pPr>
-        <w:pStyle w:val="ListNumber"/>
-      </w:pPr>
-      <w:r>
-        <w:rPr>
-          <w:b/>
-        </w:rPr>
-        <w:t>Auch lesende git-Befehle haengen ueber SMB.</w:t>
-      </w:r>
-      <w:r>
-        <w:t xml:space="preserve"> </w:t>
-      </w:r>
-      <w:r>
-        <w:rPr>
-          <w:rFonts w:ascii="Consolas" w:hAnsi="Consolas"/>
-          <w:sz w:val="20"/>
-        </w:rPr>
-        <w:t>git status --porcelain</w:t>
-      </w:r>
-      <w:r>
-        <w:t xml:space="preserve"> gegen das</w:t>
-      </w:r>
-    </w:p>
-    <w:p>
-      <w:r>
-        <w:t xml:space="preserve">   NAS-Repo lief in den 2-Minuten-Timeout, waehrend im Hintergrund ein Lauf und der</w:t>
-      </w:r>
-    </w:p>
-    <w:p>
-      <w:r>
-        <w:t xml:space="preserve">   15-Min-Committer aktiv waren. Rule 260726 nennt nur schreibende Befehle — praezisiert</w:t>
-      </w:r>
-    </w:p>
-    <w:p>
-      <w:r>
-        <w:t xml:space="preserve">   in </w:t>
-      </w:r>
-      <w:r>
-        <w:rPr>
-          <w:rFonts w:ascii="Consolas" w:hAnsi="Consolas"/>
-          <w:sz w:val="20"/>
-        </w:rPr>
-        <w:t>rules/betrieb-chronik.md</w:t>
-      </w:r>
-      <w:r>
-        <w:t>, Eintrag 260729.</w:t>
-      </w:r>
-    </w:p>
-    <w:p>
-      <w:pPr>
-        <w:pStyle w:val="ListNumber"/>
-      </w:pPr>
-      <w:r>
-        <w:rPr>
-          <w:b/>
-        </w:rPr>
-        <w:t>Zwei verwaiste Claude-Worktrees</w:t>
-      </w:r>
-      <w:r>
-        <w:t xml:space="preserve"> unter </w:t>
-      </w:r>
-      <w:r>
-        <w:rPr>
-          <w:rFonts w:ascii="Consolas" w:hAnsi="Consolas"/>
-          <w:sz w:val="20"/>
-        </w:rPr>
-        <w:t>.claude/worktrees/</w:t>
-      </w:r>
-      <w:r>
-        <w:t xml:space="preserve"> (amazing-feistel,</w:t>
-      </w:r>
-    </w:p>
-    <w:p>
-      <w:r>
-        <w:t xml:space="preserve">   jolly-brattain) auf einem alten Commit. Nicht angetastet, aber aufraeumenswert.</w:t>
-      </w:r>
-    </w:p>
-    <w:p>
-      <w:pPr>
-        <w:pStyle w:val="Heading2"/>
-      </w:pPr>
-      <w:r>
-        <w:t>Geaenderte und neue Dateien</w:t>
-      </w:r>
-    </w:p>
-    <w:p>
-      <w:r>
-        <w:rPr>
-          <w:b/>
-        </w:rPr>
-        <w:t>Neu</w:t>
+        <w:t>heartbeat</w:t>
+      </w:r>
+      <w:r>
+        <w:t xml:space="preserve"> verankert, damit die Luecke nicht wieder still entsteht.</w:t>
       </w:r>
     </w:p>
     <w:p>
@@ -2516,11 +2704,150 @@
         <w:ind w:left="340"/>
       </w:pPr>
       <w:r>
+        <w:t>Kurzregel im importierten Betriebs-Abschnitt, Chronik-Eintrag mit dem vollen Beleg.</w:t>
+      </w:r>
+    </w:p>
+    <w:p>
+      <w:r>
+        <w:rPr>
+          <w:b/>
+        </w:rPr>
+        <w:t>Offen — braucht Raphaels Hand:</w:t>
+      </w:r>
+      <w:r>
+        <w:t xml:space="preserve"> Das Setzen des Vertrauens fuer</w:t>
+      </w:r>
+    </w:p>
+    <w:p>
+      <w:r>
         <w:rPr>
           <w:rFonts w:ascii="Consolas" w:hAnsi="Consolas"/>
           <w:sz w:val="20"/>
         </w:rPr>
-        <w:t>rules/betrieb-chronik.md</w:t>
+        <w:t>/Volumes/daten/jans-ai-hub</w:t>
+      </w:r>
+      <w:r>
+        <w:t xml:space="preserve"> wurde vom Sicherheits-Klassifikator blockiert (Schreibzugriff</w:t>
+      </w:r>
+    </w:p>
+    <w:p>
+      <w:r>
+        <w:t xml:space="preserve">auf </w:t>
+      </w:r>
+      <w:r>
+        <w:rPr>
+          <w:rFonts w:ascii="Consolas" w:hAnsi="Consolas"/>
+          <w:sz w:val="20"/>
+        </w:rPr>
+        <w:t>~/.claude.json</w:t>
+      </w:r>
+      <w:r>
+        <w:t>, die Datei, die Projekt-Vertrauen steuert). Das ist angemessen — die</w:t>
+      </w:r>
+    </w:p>
+    <w:p>
+      <w:r>
+        <w:t>Entscheidung, einem Verzeichnis die vollen Projekt-Berechtigungen zu geben, gehoert dem</w:t>
+      </w:r>
+    </w:p>
+    <w:p>
+      <w:r>
+        <w:t xml:space="preserve">Benutzer. Zwei Wege: </w:t>
+      </w:r>
+      <w:r>
+        <w:rPr>
+          <w:rFonts w:ascii="Consolas" w:hAnsi="Consolas"/>
+          <w:sz w:val="20"/>
+        </w:rPr>
+        <w:t>bash scripts/trust-check.sh --alle</w:t>
+      </w:r>
+      <w:r>
+        <w:t xml:space="preserve"> selbst ausfuehren, oder einmal</w:t>
+      </w:r>
+    </w:p>
+    <w:p>
+      <w:r>
+        <w:t xml:space="preserve">interaktiv </w:t>
+      </w:r>
+      <w:r>
+        <w:rPr>
+          <w:rFonts w:ascii="Consolas" w:hAnsi="Consolas"/>
+          <w:sz w:val="20"/>
+        </w:rPr>
+        <w:t>claude</w:t>
+      </w:r>
+      <w:r>
+        <w:t xml:space="preserve"> in </w:t>
+      </w:r>
+      <w:r>
+        <w:rPr>
+          <w:rFonts w:ascii="Consolas" w:hAnsi="Consolas"/>
+          <w:sz w:val="20"/>
+        </w:rPr>
+        <w:t>/Volumes/daten/jans-ai-hub</w:t>
+      </w:r>
+      <w:r>
+        <w:t xml:space="preserve"> starten und den Dialog bestaetigen.</w:t>
+      </w:r>
+    </w:p>
+    <w:p>
+      <w:r>
+        <w:rPr>
+          <w:b/>
+        </w:rPr>
+        <w:t>Der produktive Schaden ist davon unabhaengig bereits behoben</w:t>
+      </w:r>
+      <w:r>
+        <w:t xml:space="preserve"> — die Loops laufen jetzt</w:t>
+      </w:r>
+    </w:p>
+    <w:p>
+      <w:r>
+        <w:t>alle im vertrauten SSD-Klon.</w:t>
+      </w:r>
+    </w:p>
+    <w:p>
+      <w:r>
+        <w:rPr>
+          <w:b/>
+        </w:rPr>
+        <w:t>Verallgemeinerte Lehre:</w:t>
+      </w:r>
+      <w:r>
+        <w:t xml:space="preserve"> Ein automatischer Lauf muss sein Arbeitsverzeichnis kennen und</w:t>
+      </w:r>
+    </w:p>
+    <w:p>
+      <w:r>
+        <w:t xml:space="preserve">protokollieren. </w:t>
+      </w:r>
+      <w:r>
+        <w:rPr>
+          <w:rFonts w:ascii="Consolas" w:hAnsi="Consolas"/>
+          <w:sz w:val="20"/>
+        </w:rPr>
+        <w:t>cd</w:t>
+      </w:r>
+      <w:r>
+        <w:t xml:space="preserve"> ist bei headless Laeufen kein Schoenheitsdetail, sondern entscheidet,</w:t>
+      </w:r>
+    </w:p>
+    <w:p>
+      <w:r>
+        <w:t>ob Berechtigungen und Kontext ueberhaupt geladen werden. Und rc=0 bleibt kein Beleg fuer</w:t>
+      </w:r>
+    </w:p>
+    <w:p>
+      <w:r>
+        <w:t>geleistete Arbeit.</w:t>
+      </w:r>
+    </w:p>
+    <w:p>
+      <w:pPr>
+        <w:pStyle w:val="Heading2"/>
+      </w:pPr>
+      <w:r>
+        <w:t>Was bewusst NICHT umgesetzt wurde</w:t>
       </w:r>
     </w:p>
     <w:p>
@@ -2530,10 +2857,32 @@
       </w:pPr>
       <w:r>
         <w:rPr>
+          <w:b/>
+        </w:rPr>
+        <w:t>Enterprise-Policy-Ebene</w:t>
+      </w:r>
+      <w:r>
+        <w:t xml:space="preserve"> (</w:t>
+      </w:r>
+      <w:r>
+        <w:rPr>
           <w:rFonts w:ascii="Consolas" w:hAnsi="Consolas"/>
           <w:sz w:val="20"/>
         </w:rPr>
-        <w:t>templates/user-level/CLAUDE.md</w:t>
+        <w:t>/Library/Application Support/ClaudeCode/</w:t>
+      </w:r>
+      <w:r>
+        <w:t>): fuer zwei</w:t>
+      </w:r>
+    </w:p>
+    <w:p>
+      <w:r>
+        <w:t xml:space="preserve">  Stationen Overhead. Wird relevant, sobald weitere Mitarbeitende eigene Stationen</w:t>
+      </w:r>
+    </w:p>
+    <w:p>
+      <w:r>
+        <w:t xml:space="preserve">  bekommen. Als offener Punkt erfasst.</w:t>
       </w:r>
     </w:p>
     <w:p>
@@ -2543,10 +2892,27 @@
       </w:pPr>
       <w:r>
         <w:rPr>
+          <w:b/>
+        </w:rPr>
+        <w:t>`/install-github-app`</w:t>
+      </w:r>
+      <w:r>
+        <w:t xml:space="preserve"> (@claude auf Issues/PRs): der Hub nutzt GitHub nur als Backup,</w:t>
+      </w:r>
+    </w:p>
+    <w:p>
+      <w:r>
+        <w:t xml:space="preserve">  der Handy-Weg ueber </w:t>
+      </w:r>
+      <w:r>
+        <w:rPr>
           <w:rFonts w:ascii="Consolas" w:hAnsi="Consolas"/>
           <w:sz w:val="20"/>
         </w:rPr>
-        <w:t>scripts/user-claude-sync.sh</w:t>
+        <w:t>dispatch-run.sh</w:t>
+      </w:r>
+      <w:r>
+        <w:t xml:space="preserve"> ist etabliert. Als offener Punkt erfasst.</w:t>
       </w:r>
     </w:p>
     <w:p>
@@ -2556,10 +2922,233 @@
       </w:pPr>
       <w:r>
         <w:rPr>
+          <w:b/>
+        </w:rPr>
+        <w:t>User-Level-Slash-Commands</w:t>
+      </w:r>
+      <w:r>
+        <w:t xml:space="preserve"> (</w:t>
+      </w:r>
+      <w:r>
+        <w:rPr>
           <w:rFonts w:ascii="Consolas" w:hAnsi="Consolas"/>
           <w:sz w:val="20"/>
         </w:rPr>
-        <w:t>scripts/claude-run.sh</w:t>
+        <w:t>~/.claude/commands/</w:t>
+      </w:r>
+      <w:r>
+        <w:t xml:space="preserve">): waere fuer </w:t>
+      </w:r>
+      <w:r>
+        <w:rPr>
+          <w:rFonts w:ascii="Consolas" w:hAnsi="Consolas"/>
+          <w:sz w:val="20"/>
+        </w:rPr>
+        <w:t>/nas</w:t>
+      </w:r>
+      <w:r>
+        <w:t xml:space="preserve">, </w:t>
+      </w:r>
+      <w:r>
+        <w:rPr>
+          <w:rFonts w:ascii="Consolas" w:hAnsi="Consolas"/>
+          <w:sz w:val="20"/>
+        </w:rPr>
+        <w:t>/status</w:t>
+      </w:r>
+      <w:r>
+        <w:t>,</w:t>
+      </w:r>
+    </w:p>
+    <w:p>
+      <w:r>
+        <w:t xml:space="preserve">  </w:t>
+      </w:r>
+      <w:r>
+        <w:rPr>
+          <w:rFonts w:ascii="Consolas" w:hAnsi="Consolas"/>
+          <w:sz w:val="20"/>
+        </w:rPr>
+        <w:t>/m365</w:t>
+      </w:r>
+      <w:r>
+        <w:t xml:space="preserve"> sinnvoll, aber nicht Teil des Auftrags. Als offener Punkt erfasst.</w:t>
+      </w:r>
+    </w:p>
+    <w:p>
+      <w:pPr>
+        <w:pStyle w:val="Heading2"/>
+      </w:pPr>
+      <w:r>
+        <w:t>Nebenbefunde aus der Messung</w:t>
+      </w:r>
+    </w:p>
+    <w:p>
+      <w:pPr>
+        <w:pStyle w:val="ListNumber"/>
+      </w:pPr>
+      <w:r>
+        <w:rPr>
+          <w:b/>
+        </w:rPr>
+        <w:t>Workspace nicht «trusted» — nachgegangen, ein realer Ertragsverlust gefunden.</w:t>
+      </w:r>
+    </w:p>
+    <w:p>
+      <w:r>
+        <w:t xml:space="preserve">   Siehe eigenen Abschnitt «Massnahme 7» unten.</w:t>
+      </w:r>
+    </w:p>
+    <w:p>
+      <w:pPr>
+        <w:pStyle w:val="ListNumber"/>
+      </w:pPr>
+      <w:r>
+        <w:rPr>
+          <w:b/>
+        </w:rPr>
+        <w:t>Cache-Creation dominiert die Kosten kleiner Laeufe.</w:t>
+      </w:r>
+      <w:r>
+        <w:t xml:space="preserve"> Ein Testlauf mit dem Prompt</w:t>
+      </w:r>
+    </w:p>
+    <w:p>
+      <w:r>
+        <w:t xml:space="preserve">   «Antworte mit genau dem Wort: OK» erzeugte 89'618 Cache-Creation-Token und 0.54 USD —</w:t>
+      </w:r>
+    </w:p>
+    <w:p>
+      <w:r>
+        <w:t xml:space="preserve">   bei 2 Input- und 4 Output-Token. Der zweite Lauf: 0.42 USD, 470 Sekunden, ein Turn, zwei</w:t>
+      </w:r>
+    </w:p>
+    <w:p>
+      <w:r>
+        <w:t xml:space="preserve">   Zeichen Antwort. Der Grundkontext ist der Kostentreiber, nicht die Aufgabe. Das ist das</w:t>
+      </w:r>
+    </w:p>
+    <w:p>
+      <w:r>
+        <w:t xml:space="preserve">   staerkste Argument fuer die Kontext-Diaet und dafuer, wenige lange statt vieler kurzer</w:t>
+      </w:r>
+    </w:p>
+    <w:p>
+      <w:r>
+        <w:t xml:space="preserve">   automatischer Laeufe zu fahren.</w:t>
+      </w:r>
+    </w:p>
+    <w:p>
+      <w:pPr>
+        <w:pStyle w:val="ListNumber"/>
+      </w:pPr>
+      <w:r>
+        <w:rPr>
+          <w:b/>
+        </w:rPr>
+        <w:t>Startzeit rund 7-8 Minuten je headless Lauf</w:t>
+      </w:r>
+      <w:r>
+        <w:t xml:space="preserve"> (MCP-Server-Start). Bei Loops faellt das</w:t>
+      </w:r>
+    </w:p>
+    <w:p>
+      <w:r>
+        <w:t xml:space="preserve">   nicht auf, macht aber jeden trivialen automatischen Lauf unwirtschaftlich.</w:t>
+      </w:r>
+    </w:p>
+    <w:p>
+      <w:pPr>
+        <w:pStyle w:val="ListNumber"/>
+      </w:pPr>
+      <w:r>
+        <w:rPr>
+          <w:b/>
+        </w:rPr>
+        <w:t>Auch lesende git-Befehle haengen ueber SMB.</w:t>
+      </w:r>
+      <w:r>
+        <w:t xml:space="preserve"> </w:t>
+      </w:r>
+      <w:r>
+        <w:rPr>
+          <w:rFonts w:ascii="Consolas" w:hAnsi="Consolas"/>
+          <w:sz w:val="20"/>
+        </w:rPr>
+        <w:t>git status --porcelain</w:t>
+      </w:r>
+      <w:r>
+        <w:t xml:space="preserve"> gegen das</w:t>
+      </w:r>
+    </w:p>
+    <w:p>
+      <w:r>
+        <w:t xml:space="preserve">   NAS-Repo lief in den 2-Minuten-Timeout, waehrend im Hintergrund ein Lauf und der</w:t>
+      </w:r>
+    </w:p>
+    <w:p>
+      <w:r>
+        <w:t xml:space="preserve">   15-Min-Committer aktiv waren. Rule 260726 nennt nur schreibende Befehle — praezisiert</w:t>
+      </w:r>
+    </w:p>
+    <w:p>
+      <w:r>
+        <w:t xml:space="preserve">   in </w:t>
+      </w:r>
+      <w:r>
+        <w:rPr>
+          <w:rFonts w:ascii="Consolas" w:hAnsi="Consolas"/>
+          <w:sz w:val="20"/>
+        </w:rPr>
+        <w:t>rules/betrieb-chronik.md</w:t>
+      </w:r>
+      <w:r>
+        <w:t>, Eintrag 260729.</w:t>
+      </w:r>
+    </w:p>
+    <w:p>
+      <w:pPr>
+        <w:pStyle w:val="ListNumber"/>
+      </w:pPr>
+      <w:r>
+        <w:rPr>
+          <w:b/>
+        </w:rPr>
+        <w:t>Zwei verwaiste Claude-Worktrees</w:t>
+      </w:r>
+      <w:r>
+        <w:t xml:space="preserve"> unter </w:t>
+      </w:r>
+      <w:r>
+        <w:rPr>
+          <w:rFonts w:ascii="Consolas" w:hAnsi="Consolas"/>
+          <w:sz w:val="20"/>
+        </w:rPr>
+        <w:t>.claude/worktrees/</w:t>
+      </w:r>
+      <w:r>
+        <w:t xml:space="preserve"> (amazing-feistel,</w:t>
+      </w:r>
+    </w:p>
+    <w:p>
+      <w:r>
+        <w:t xml:space="preserve">   jolly-brattain) auf einem alten Commit. Nicht angetastet, aber aufraeumenswert.</w:t>
+      </w:r>
+    </w:p>
+    <w:p>
+      <w:pPr>
+        <w:pStyle w:val="Heading2"/>
+      </w:pPr>
+      <w:r>
+        <w:t>Geaenderte und neue Dateien</w:t>
+      </w:r>
+    </w:p>
+    <w:p>
+      <w:r>
+        <w:rPr>
+          <w:b/>
+        </w:rPr>
+        <w:t>Neu</w:t>
       </w:r>
     </w:p>
     <w:p>
@@ -2572,7 +3161,7 @@
           <w:rFonts w:ascii="Consolas" w:hAnsi="Consolas"/>
           <w:sz w:val="20"/>
         </w:rPr>
-        <w:t>scripts/multi-claude.sh</w:t>
+        <w:t>rules/betrieb-chronik.md</w:t>
       </w:r>
     </w:p>
     <w:p>
@@ -2585,10 +3174,7 @@
           <w:rFonts w:ascii="Consolas" w:hAnsi="Consolas"/>
           <w:sz w:val="20"/>
         </w:rPr>
-        <w:t>.mcp.json</w:t>
-      </w:r>
-      <w:r>
-        <w:t xml:space="preserve"> (auf dem NAS, neu versioniert)</w:t>
+        <w:t>templates/user-level/CLAUDE.md</w:t>
       </w:r>
     </w:p>
     <w:p>
@@ -2601,10 +3187,7 @@
           <w:rFonts w:ascii="Consolas" w:hAnsi="Consolas"/>
           <w:sz w:val="20"/>
         </w:rPr>
-        <w:t>wissen/claude-code/</w:t>
-      </w:r>
-      <w:r>
-        <w:t xml:space="preserve"> (KB mit 32 Rohbildern und 4 Wiki-Dateien)</w:t>
+        <w:t>scripts/user-claude-sync.sh</w:t>
       </w:r>
     </w:p>
     <w:p>
@@ -2613,15 +3196,11 @@
         <w:ind w:left="340"/>
       </w:pPr>
       <w:r>
-        <w:t>dieses Konzept</w:t>
-      </w:r>
-    </w:p>
-    <w:p>
-      <w:r>
         <w:rPr>
-          <w:b/>
+          <w:rFonts w:ascii="Consolas" w:hAnsi="Consolas"/>
+          <w:sz w:val="20"/>
         </w:rPr>
-        <w:t>Geaendert</w:t>
+        <w:t>scripts/claude-run.sh</w:t>
       </w:r>
     </w:p>
     <w:p>
@@ -2634,10 +3213,7 @@
           <w:rFonts w:ascii="Consolas" w:hAnsi="Consolas"/>
           <w:sz w:val="20"/>
         </w:rPr>
-        <w:t>rules/auto-verbesserungen.md</w:t>
-      </w:r>
-      <w:r>
-        <w:t xml:space="preserve"> (36'029 → rund 17'000 B, Abschnitt «Betrieb», Nachtrag 260719)</w:t>
+        <w:t>scripts/multi-claude.sh</w:t>
       </w:r>
     </w:p>
     <w:p>
@@ -2650,20 +3226,7 @@
           <w:rFonts w:ascii="Consolas" w:hAnsi="Consolas"/>
           <w:sz w:val="20"/>
         </w:rPr>
-        <w:t>CLAUDE.md</w:t>
-      </w:r>
-      <w:r>
-        <w:t xml:space="preserve"> (Abschnitt «Werkzeuge / Connectoren», User-Level-Zeile, </w:t>
-      </w:r>
-      <w:r>
-        <w:rPr>
-          <w:rFonts w:ascii="Consolas" w:hAnsi="Consolas"/>
-          <w:sz w:val="20"/>
-        </w:rPr>
-        <w:t>.mcp.json</w:t>
-      </w:r>
-      <w:r>
-        <w:t>-Status)</w:t>
+        <w:t>scripts/trust-check.sh</w:t>
       </w:r>
     </w:p>
     <w:p>
@@ -2676,10 +3239,10 @@
           <w:rFonts w:ascii="Consolas" w:hAnsi="Consolas"/>
           <w:sz w:val="20"/>
         </w:rPr>
-        <w:t>connectors/README.md</w:t>
-      </w:r>
-      <w:r>
-        <w:t xml:space="preserve"> (Werkzeug-Index aller 16 Connectoren)</w:t>
+        <w:t>.mcp.json</w:t>
+      </w:r>
+      <w:r>
+        <w:t xml:space="preserve"> (auf dem NAS, neu versioniert)</w:t>
       </w:r>
     </w:p>
     <w:p>
@@ -2692,10 +3255,59 @@
           <w:rFonts w:ascii="Consolas" w:hAnsi="Consolas"/>
           <w:sz w:val="20"/>
         </w:rPr>
-        <w:t>.gitignore</w:t>
-      </w:r>
-      <w:r>
-        <w:t xml:space="preserve"> (</w:t>
+        <w:t>wissen/claude-code/</w:t>
+      </w:r>
+      <w:r>
+        <w:t xml:space="preserve"> (KB mit 32 Rohbildern und 4 Wiki-Dateien)</w:t>
+      </w:r>
+    </w:p>
+    <w:p>
+      <w:pPr>
+        <w:pStyle w:val="ListBullet"/>
+        <w:ind w:left="340"/>
+      </w:pPr>
+      <w:r>
+        <w:t>dieses Konzept</w:t>
+      </w:r>
+    </w:p>
+    <w:p>
+      <w:r>
+        <w:rPr>
+          <w:b/>
+        </w:rPr>
+        <w:t>Geaendert</w:t>
+      </w:r>
+    </w:p>
+    <w:p>
+      <w:pPr>
+        <w:pStyle w:val="ListBullet"/>
+        <w:ind w:left="340"/>
+      </w:pPr>
+      <w:r>
+        <w:rPr>
+          <w:rFonts w:ascii="Consolas" w:hAnsi="Consolas"/>
+          <w:sz w:val="20"/>
+        </w:rPr>
+        <w:t>rules/auto-verbesserungen.md</w:t>
+      </w:r>
+      <w:r>
+        <w:t xml:space="preserve"> (36'029 → rund 17'000 B, Abschnitt «Betrieb», Nachtrag 260719)</w:t>
+      </w:r>
+    </w:p>
+    <w:p>
+      <w:pPr>
+        <w:pStyle w:val="ListBullet"/>
+        <w:ind w:left="340"/>
+      </w:pPr>
+      <w:r>
+        <w:rPr>
+          <w:rFonts w:ascii="Consolas" w:hAnsi="Consolas"/>
+          <w:sz w:val="20"/>
+        </w:rPr>
+        <w:t>CLAUDE.md</w:t>
+      </w:r>
+      <w:r>
+        <w:t xml:space="preserve"> (Abschnitt «Werkzeuge / Connectoren», User-Level-Zeile, </w:t>
       </w:r>
       <w:r>
         <w:rPr>
@@ -2705,7 +3317,127 @@
         <w:t>.mcp.json</w:t>
       </w:r>
       <w:r>
-        <w:t xml:space="preserve"> freigegeben, mit Begruendung)</w:t>
+        <w:t>-Status)</w:t>
+      </w:r>
+    </w:p>
+    <w:p>
+      <w:pPr>
+        <w:pStyle w:val="ListBullet"/>
+        <w:ind w:left="340"/>
+      </w:pPr>
+      <w:r>
+        <w:rPr>
+          <w:rFonts w:ascii="Consolas" w:hAnsi="Consolas"/>
+          <w:sz w:val="20"/>
+        </w:rPr>
+        <w:t>connectors/README.md</w:t>
+      </w:r>
+      <w:r>
+        <w:t xml:space="preserve"> (Werkzeug-Index aller 16 Connectoren)</w:t>
+      </w:r>
+    </w:p>
+    <w:p>
+      <w:pPr>
+        <w:pStyle w:val="ListBullet"/>
+        <w:ind w:left="340"/>
+      </w:pPr>
+      <w:r>
+        <w:rPr>
+          <w:rFonts w:ascii="Consolas" w:hAnsi="Consolas"/>
+          <w:sz w:val="20"/>
+        </w:rPr>
+        <w:t>.gitignore</w:t>
+      </w:r>
+      <w:r>
+        <w:t xml:space="preserve"> (</w:t>
+      </w:r>
+      <w:r>
+        <w:rPr>
+          <w:rFonts w:ascii="Consolas" w:hAnsi="Consolas"/>
+          <w:sz w:val="20"/>
+        </w:rPr>
+        <w:t>.mcp.json</w:t>
+      </w:r>
+      <w:r>
+        <w:t xml:space="preserve"> freigegeben, </w:t>
+      </w:r>
+      <w:r>
+        <w:rPr>
+          <w:rFonts w:ascii="Consolas" w:hAnsi="Consolas"/>
+          <w:sz w:val="20"/>
+        </w:rPr>
+        <w:t>logbuch/laeufe/</w:t>
+      </w:r>
+      <w:r>
+        <w:t xml:space="preserve"> ausgeschlossen, je mit Begruendung)</w:t>
+      </w:r>
+    </w:p>
+    <w:p>
+      <w:pPr>
+        <w:pStyle w:val="ListBullet"/>
+        <w:ind w:left="340"/>
+      </w:pPr>
+      <w:r>
+        <w:rPr>
+          <w:rFonts w:ascii="Consolas" w:hAnsi="Consolas"/>
+          <w:sz w:val="20"/>
+        </w:rPr>
+        <w:t>scripts/wissens-trigger.sh</w:t>
+      </w:r>
+      <w:r>
+        <w:t xml:space="preserve"> (</w:t>
+      </w:r>
+      <w:r>
+        <w:rPr>
+          <w:rFonts w:ascii="Consolas" w:hAnsi="Consolas"/>
+          <w:sz w:val="20"/>
+        </w:rPr>
+        <w:t>cd</w:t>
+      </w:r>
+      <w:r>
+        <w:t xml:space="preserve"> ins Projekt + Arbeitsverzeichnis im Log)</w:t>
+      </w:r>
+    </w:p>
+    <w:p>
+      <w:pPr>
+        <w:pStyle w:val="ListBullet"/>
+        <w:ind w:left="340"/>
+      </w:pPr>
+      <w:r>
+        <w:rPr>
+          <w:rFonts w:ascii="Consolas" w:hAnsi="Consolas"/>
+          <w:sz w:val="20"/>
+        </w:rPr>
+        <w:t>scripts/vollgas-runner.sh</w:t>
+      </w:r>
+      <w:r>
+        <w:t xml:space="preserve">, </w:t>
+      </w:r>
+      <w:r>
+        <w:rPr>
+          <w:rFonts w:ascii="Consolas" w:hAnsi="Consolas"/>
+          <w:sz w:val="20"/>
+        </w:rPr>
+        <w:t>scripts/dispatch-run.sh</w:t>
+      </w:r>
+      <w:r>
+        <w:t xml:space="preserve"> (auf den JSON-Wrapper umgestellt)</w:t>
+      </w:r>
+    </w:p>
+    <w:p>
+      <w:pPr>
+        <w:pStyle w:val="ListBullet"/>
+        <w:ind w:left="340"/>
+      </w:pPr>
+      <w:r>
+        <w:rPr>
+          <w:rFonts w:ascii="Consolas" w:hAnsi="Consolas"/>
+          <w:sz w:val="20"/>
+        </w:rPr>
+        <w:t>skills/heartbeat/SKILL.md</w:t>
+      </w:r>
+      <w:r>
+        <w:t xml:space="preserve"> (Check 8: Projekt-Vertrauen)</w:t>
       </w:r>
     </w:p>
     <w:sectPr>

</xml_diff>